<commit_message>
Inclui fotografias e corrige participantes do segundo relatorio
</commit_message>
<xml_diff>
--- a/FisicaEx02/Relatorio_Final.docx
+++ b/FisicaEx02/Relatorio_Final.docx
@@ -46,14 +46,6 @@
         <w:pStyle w:val="Autor"/>
       </w:pPr>
       <w:r>
-        <w:t>Arthur Borges Fernandes</w:t>
-      </w:r>
-      <w:r>
-        <w:br/>
-        <w:t>Enzo Cerezine Oliveira</w:t>
-      </w:r>
-      <w:r>
-        <w:br/>
         <w:t>Heitor Yochida de Ávila</w:t>
       </w:r>
       <w:r>
@@ -247,14 +239,6 @@
       </w:r>
       <w:r>
         <w:br/>
-        <w:t>12621EAU004</w:t>
-      </w:r>
-      <w:r>
-        <w:br/>
-        <w:t>12621EAU002</w:t>
-      </w:r>
-      <w:r>
-        <w:br/>
         <w:t>12612ETE002</w:t>
       </w:r>
       <w:r>
@@ -390,13 +374,13 @@
         <w:ind w:firstLine="0"/>
       </w:pPr>
       <w:r>
-        <w:t>Figura 1 – Dados de distância e tempo antes da linearização</w:t>
+        <w:t>Figura 1 – Trilho de ar (à esquerda) e fonte de ar (à direita)</w:t>
       </w:r>
       <w:r>
         <w:tab/>
       </w:r>
       <w:r>
-        <w:t>10</w:t>
+        <w:t>9</w:t>
       </w:r>
     </w:p>
     <w:p>
@@ -407,13 +391,13 @@
         <w:ind w:firstLine="0"/>
       </w:pPr>
       <w:r>
-        <w:t>Figura 2 – Linearização logarítmica e reta ajustada</w:t>
+        <w:t>Figura 2 – Sensores (à esquerda) e painel de medição (à direita)</w:t>
       </w:r>
       <w:r>
         <w:tab/>
       </w:r>
       <w:r>
-        <w:t>12</w:t>
+        <w:t>10</w:t>
       </w:r>
     </w:p>
     <w:p>
@@ -424,13 +408,47 @@
         <w:ind w:firstLine="0"/>
       </w:pPr>
       <w:r>
-        <w:t>Figura 3 – Lei de potência na escala original</w:t>
+        <w:t>Figura 3 – Dados de distância e tempo antes da linearização</w:t>
       </w:r>
       <w:r>
         <w:tab/>
       </w:r>
       <w:r>
-        <w:t>13</w:t>
+        <w:t>12</w:t>
+      </w:r>
+    </w:p>
+    <w:p>
+      <w:pPr>
+        <w:tabs>
+          <w:tab w:val="right" w:pos="9071"/>
+        </w:tabs>
+        <w:ind w:firstLine="0"/>
+      </w:pPr>
+      <w:r>
+        <w:t>Figura 4 – Linearização logarítmica e reta ajustada</w:t>
+      </w:r>
+      <w:r>
+        <w:tab/>
+      </w:r>
+      <w:r>
+        <w:t>14</w:t>
+      </w:r>
+    </w:p>
+    <w:p>
+      <w:pPr>
+        <w:tabs>
+          <w:tab w:val="right" w:pos="9071"/>
+        </w:tabs>
+        <w:ind w:firstLine="0"/>
+      </w:pPr>
+      <w:r>
+        <w:t>Figura 5 – Lei de potência na escala original</w:t>
+      </w:r>
+      <w:r>
+        <w:tab/>
+      </w:r>
+      <w:r>
+        <w:t>15</w:t>
       </w:r>
     </w:p>
     <w:p>
@@ -502,7 +520,7 @@
         <w:tab/>
       </w:r>
       <w:r>
-        <w:t>9</w:t>
+        <w:t>11</w:t>
       </w:r>
     </w:p>
     <w:p>
@@ -519,7 +537,7 @@
         <w:tab/>
       </w:r>
       <w:r>
-        <w:t>11</w:t>
+        <w:t>13</w:t>
       </w:r>
     </w:p>
     <w:p>
@@ -536,7 +554,7 @@
         <w:tab/>
       </w:r>
       <w:r>
-        <w:t>13</w:t>
+        <w:t>15</w:t>
       </w:r>
     </w:p>
     <w:p>
@@ -729,6 +747,29 @@
     </w:p>
     <w:p>
       <w:pPr>
+        <w:pStyle w:val="TOC2"/>
+        <w:rPr>
+          <w:rFonts w:asciiTheme="minorHAnsi" w:eastAsiaTheme="minorEastAsia" w:hAnsiTheme="minorHAnsi" w:cstheme="minorBidi"/>
+          <w:b w:val="0"/>
+          <w:noProof/>
+          <w:color w:val="auto"/>
+          <w:kern w:val="2"/>
+          <w:szCs w:val="24"/>
+          <w14:ligatures w14:val="standardContextual"/>
+        </w:rPr>
+      </w:pPr>
+      <w:r>
+        <w:t>3.1 Registros fotográficos</w:t>
+      </w:r>
+      <w:r>
+        <w:tab/>
+      </w:r>
+      <w:r>
+        <w:t>9</w:t>
+      </w:r>
+    </w:p>
+    <w:p>
+      <w:pPr>
         <w:pStyle w:val="TOC1"/>
         <w:rPr>
           <w:rFonts w:asciiTheme="minorHAnsi" w:eastAsiaTheme="minorEastAsia" w:hAnsiTheme="minorHAnsi" w:cstheme="minorBidi"/>
@@ -756,7 +797,7 @@
         <w:rPr>
           <w:noProof w:val="0"/>
         </w:rPr>
-        <w:t>9</w:t>
+        <w:t>11</w:t>
       </w:r>
     </w:p>
     <w:p>
@@ -779,7 +820,7 @@
         <w:tab/>
       </w:r>
       <w:r>
-        <w:t>9</w:t>
+        <w:t>11</w:t>
       </w:r>
     </w:p>
     <w:p>
@@ -802,7 +843,7 @@
         <w:tab/>
       </w:r>
       <w:r>
-        <w:t>11</w:t>
+        <w:t>13</w:t>
       </w:r>
     </w:p>
     <w:p>
@@ -825,7 +866,7 @@
         <w:tab/>
       </w:r>
       <w:r>
-        <w:t>13</w:t>
+        <w:t>15</w:t>
       </w:r>
     </w:p>
     <w:p>
@@ -848,7 +889,7 @@
         <w:tab/>
       </w:r>
       <w:r>
-        <w:t>14</w:t>
+        <w:t>16</w:t>
       </w:r>
     </w:p>
     <w:p>
@@ -880,7 +921,7 @@
         <w:rPr>
           <w:noProof w:val="0"/>
         </w:rPr>
-        <w:t>15</w:t>
+        <w:t>17</w:t>
       </w:r>
     </w:p>
     <w:p>
@@ -912,7 +953,7 @@
         <w:rPr>
           <w:noProof w:val="0"/>
         </w:rPr>
-        <w:t>16</w:t>
+        <w:t>18</w:t>
       </w:r>
     </w:p>
     <w:p>
@@ -1136,13 +1177,7 @@
           <w:rPr>
             <w:rFonts w:ascii="Cambria Math" w:hAnsi="Cambria Math"/>
           </w:rPr>
-          <m:t>s</m:t>
-        </m:r>
-        <m:r>
-          <w:rPr>
-            <w:rFonts w:ascii="Cambria Math" w:hAnsi="Cambria Math"/>
-          </w:rPr>
-          <m:t>=</m:t>
+          <m:t>s=</m:t>
         </m:r>
         <m:rad>
           <m:radPr>
@@ -1484,13 +1519,7 @@
           <w:rPr>
             <w:rFonts w:ascii="Cambria Math" w:hAnsi="Cambria Math"/>
           </w:rPr>
-          <m:t>X</m:t>
-        </m:r>
-        <m:r>
-          <w:rPr>
-            <w:rFonts w:ascii="Cambria Math" w:hAnsi="Cambria Math"/>
-          </w:rPr>
-          <m:t>=</m:t>
+          <m:t>X=</m:t>
         </m:r>
         <m:r>
           <m:rPr>
@@ -1502,19 +1531,7 @@
           <w:rPr>
             <w:rFonts w:ascii="Cambria Math" w:hAnsi="Cambria Math"/>
           </w:rPr>
-          <m:t>;</m:t>
-        </m:r>
-        <m:r>
-          <w:rPr>
-            <w:rFonts w:ascii="Cambria Math" w:hAnsi="Cambria Math"/>
-          </w:rPr>
-          <m:t>Y</m:t>
-        </m:r>
-        <m:r>
-          <w:rPr>
-            <w:rFonts w:ascii="Cambria Math" w:hAnsi="Cambria Math"/>
-          </w:rPr>
-          <m:t>=</m:t>
+          <m:t>;Y=</m:t>
         </m:r>
         <m:r>
           <m:rPr>
@@ -1547,25 +1564,7 @@
           <w:rPr>
             <w:rFonts w:ascii="Cambria Math" w:hAnsi="Cambria Math"/>
           </w:rPr>
-          <m:t>Y</m:t>
-        </m:r>
-        <m:r>
-          <w:rPr>
-            <w:rFonts w:ascii="Cambria Math" w:hAnsi="Cambria Math"/>
-          </w:rPr>
-          <m:t>=</m:t>
-        </m:r>
-        <m:r>
-          <w:rPr>
-            <w:rFonts w:ascii="Cambria Math" w:hAnsi="Cambria Math"/>
-          </w:rPr>
-          <m:t>A</m:t>
-        </m:r>
-        <m:r>
-          <w:rPr>
-            <w:rFonts w:ascii="Cambria Math" w:hAnsi="Cambria Math"/>
-          </w:rPr>
-          <m:t>+</m:t>
+          <m:t>Y=A+</m:t>
         </m:r>
         <m:r>
           <m:rPr>
@@ -1580,19 +1579,7 @@
           <w:rPr>
             <w:rFonts w:ascii="Cambria Math" w:hAnsi="Cambria Math"/>
           </w:rPr>
-          <m:t>;</m:t>
-        </m:r>
-        <m:r>
-          <w:rPr>
-            <w:rFonts w:ascii="Cambria Math" w:hAnsi="Cambria Math"/>
-          </w:rPr>
-          <m:t>A</m:t>
-        </m:r>
-        <m:r>
-          <w:rPr>
-            <w:rFonts w:ascii="Cambria Math" w:hAnsi="Cambria Math"/>
-          </w:rPr>
-          <m:t>=</m:t>
+          <m:t>;A=</m:t>
         </m:r>
         <m:r>
           <m:rPr>
@@ -1830,13 +1817,7 @@
           <w:rPr>
             <w:rFonts w:ascii="Cambria Math" w:hAnsi="Cambria Math"/>
           </w:rPr>
-          <m:t>n</m:t>
-        </m:r>
-        <m:r>
-          <w:rPr>
-            <w:rFonts w:ascii="Cambria Math" w:hAnsi="Cambria Math"/>
-          </w:rPr>
-          <m:t>=</m:t>
+          <m:t>n=</m:t>
         </m:r>
         <m:f>
           <m:fPr>
@@ -1867,19 +1848,7 @@
           <w:rPr>
             <w:rFonts w:ascii="Cambria Math" w:hAnsi="Cambria Math"/>
           </w:rPr>
-          <m:t>;</m:t>
-        </m:r>
-        <m:r>
-          <w:rPr>
-            <w:rFonts w:ascii="Cambria Math" w:hAnsi="Cambria Math"/>
-          </w:rPr>
-          <m:t>A</m:t>
-        </m:r>
-        <m:r>
-          <w:rPr>
-            <w:rFonts w:ascii="Cambria Math" w:hAnsi="Cambria Math"/>
-          </w:rPr>
-          <m:t>=</m:t>
+          <m:t>;A=</m:t>
         </m:r>
         <m:f>
           <m:fPr>
@@ -2101,13 +2070,7 @@
           <w:rPr>
             <w:rFonts w:ascii="Cambria Math" w:hAnsi="Cambria Math"/>
           </w:rPr>
-          <m:t>C</m:t>
-        </m:r>
-        <m:r>
-          <w:rPr>
-            <w:rFonts w:ascii="Cambria Math" w:hAnsi="Cambria Math"/>
-          </w:rPr>
-          <m:t>=</m:t>
+          <m:t>C=</m:t>
         </m:r>
         <m:sSub>
           <m:sSubPr>
@@ -2194,13 +2157,7 @@
           <w:rPr>
             <w:rFonts w:ascii="Cambria Math" w:hAnsi="Cambria Math"/>
           </w:rPr>
-          <m:t>=</m:t>
-        </m:r>
-        <m:r>
-          <w:rPr>
-            <w:rFonts w:ascii="Cambria Math" w:hAnsi="Cambria Math"/>
-          </w:rPr>
-          <m:t>C</m:t>
+          <m:t>=C</m:t>
         </m:r>
         <m:sSub>
           <m:sSubPr>
@@ -3835,6 +3792,267 @@
     </w:p>
     <w:p>
       <w:pPr>
+        <w:pStyle w:val="Heading2"/>
+        <w:pageBreakBefore/>
+      </w:pPr>
+      <w:r>
+        <w:lastRenderedPageBreak/>
+        <w:t>3.1 Registros fotográficos</w:t>
+      </w:r>
+    </w:p>
+    <w:p>
+      <w:r>
+        <w:t>As Figuras 1 e 2 apresentam a montagem utilizada na prática. Os registros mostram o trilho com escala de distância, a fonte de ar, os sensores e o painel de medição. As fotografias documentam os componentes do sistema; os valores utilizados na análise são os registrados na Tabela 1.</w:t>
+      </w:r>
+    </w:p>
+    <w:p>
+      <w:pPr>
+        <w:keepNext/>
+        <w:spacing w:before="240" w:after="120" w:line="240" w:lineRule="auto"/>
+        <w:ind w:firstLine="0"/>
+      </w:pPr>
+      <w:r>
+        <w:rPr>
+          <w:sz w:val="20"/>
+        </w:rPr>
+        <w:t>Figura 1 – Trilho de ar (à esquerda) e fonte de ar (à direita)</w:t>
+      </w:r>
+    </w:p>
+    <w:p>
+      <w:pPr>
+        <w:keepNext/>
+        <w:keepLines/>
+        <w:spacing w:line="240" w:lineRule="auto"/>
+        <w:ind w:firstLine="0"/>
+        <w:jc w:val="center"/>
+      </w:pPr>
+      <w:r>
+        <w:rPr>
+          <w:noProof/>
+        </w:rPr>
+        <w:drawing>
+          <wp:inline distT="0" distB="0" distL="0" distR="0" wp14:anchorId="12D63D90" wp14:editId="40046D31">
+            <wp:extent cx="2700000" cy="4800000"/>
+            <wp:effectExtent l="0" t="0" r="0" b="0"/>
+            <wp:docPr id="4" name="Picture 4"/>
+            <wp:cNvGraphicFramePr>
+              <a:graphicFrameLocks xmlns:a="http://schemas.openxmlformats.org/drawingml/2006/main" noChangeAspect="1"/>
+            </wp:cNvGraphicFramePr>
+            <a:graphic xmlns:a="http://schemas.openxmlformats.org/drawingml/2006/main">
+              <a:graphicData uri="http://schemas.openxmlformats.org/drawingml/2006/picture">
+                <pic:pic xmlns:pic="http://schemas.openxmlformats.org/drawingml/2006/picture">
+                  <pic:nvPicPr>
+                    <pic:cNvPr id="0" name="WhatsApp Image 2026-10-05 at 09.59.30 (1).jpeg"/>
+                    <pic:cNvPicPr/>
+                  </pic:nvPicPr>
+                  <pic:blipFill>
+                    <a:blip r:embed="rId16"/>
+                    <a:stretch>
+                      <a:fillRect/>
+                    </a:stretch>
+                  </pic:blipFill>
+                  <pic:spPr>
+                    <a:xfrm>
+                      <a:off x="0" y="0"/>
+                      <a:ext cx="2700000" cy="4800000"/>
+                    </a:xfrm>
+                    <a:prstGeom prst="rect">
+                      <a:avLst/>
+                    </a:prstGeom>
+                  </pic:spPr>
+                </pic:pic>
+              </a:graphicData>
+            </a:graphic>
+          </wp:inline>
+        </w:drawing>
+      </w:r>
+      <w:r>
+        <w:t xml:space="preserve">    </w:t>
+      </w:r>
+      <w:r>
+        <w:rPr>
+          <w:noProof/>
+        </w:rPr>
+        <w:drawing>
+          <wp:inline distT="0" distB="0" distL="0" distR="0" wp14:anchorId="04DDCD44" wp14:editId="4C1862B9">
+            <wp:extent cx="2700000" cy="4800000"/>
+            <wp:effectExtent l="0" t="0" r="0" b="0"/>
+            <wp:docPr id="5" name="Picture 5"/>
+            <wp:cNvGraphicFramePr>
+              <a:graphicFrameLocks xmlns:a="http://schemas.openxmlformats.org/drawingml/2006/main" noChangeAspect="1"/>
+            </wp:cNvGraphicFramePr>
+            <a:graphic xmlns:a="http://schemas.openxmlformats.org/drawingml/2006/main">
+              <a:graphicData uri="http://schemas.openxmlformats.org/drawingml/2006/picture">
+                <pic:pic xmlns:pic="http://schemas.openxmlformats.org/drawingml/2006/picture">
+                  <pic:nvPicPr>
+                    <pic:cNvPr id="0" name="WhatsApp Image 2026-10-05 at 09.59.30 (2).jpeg"/>
+                    <pic:cNvPicPr/>
+                  </pic:nvPicPr>
+                  <pic:blipFill>
+                    <a:blip r:embed="rId17"/>
+                    <a:stretch>
+                      <a:fillRect/>
+                    </a:stretch>
+                  </pic:blipFill>
+                  <pic:spPr>
+                    <a:xfrm>
+                      <a:off x="0" y="0"/>
+                      <a:ext cx="2700000" cy="4800000"/>
+                    </a:xfrm>
+                    <a:prstGeom prst="rect">
+                      <a:avLst/>
+                    </a:prstGeom>
+                  </pic:spPr>
+                </pic:pic>
+              </a:graphicData>
+            </a:graphic>
+          </wp:inline>
+        </w:drawing>
+      </w:r>
+    </w:p>
+    <w:p>
+      <w:pPr>
+        <w:spacing w:before="100" w:after="160" w:line="240" w:lineRule="auto"/>
+        <w:ind w:firstLine="0"/>
+      </w:pPr>
+      <w:r>
+        <w:rPr>
+          <w:sz w:val="20"/>
+        </w:rPr>
+        <w:t>Fonte: acervo fotográfico do experimento (29 set. 2026).</w:t>
+      </w:r>
+    </w:p>
+    <w:p>
+      <w:r>
+        <w:t>À esquerda, observa-se o trilho por onde o objeto se deslocava e a escala empregada para estabelecer as distâncias. À direita, a fonte de ar conectada ao sistema permitia reduzir o atrito entre o objeto e o suporte.</w:t>
+      </w:r>
+    </w:p>
+    <w:p>
+      <w:pPr>
+        <w:keepNext/>
+        <w:pageBreakBefore/>
+        <w:spacing w:before="240" w:after="120" w:line="240" w:lineRule="auto"/>
+        <w:ind w:firstLine="0"/>
+      </w:pPr>
+      <w:r>
+        <w:rPr>
+          <w:sz w:val="20"/>
+        </w:rPr>
+        <w:lastRenderedPageBreak/>
+        <w:t>Figura 2 – Sensores (à esquerda) e painel de medição (à direita)</w:t>
+      </w:r>
+    </w:p>
+    <w:p>
+      <w:pPr>
+        <w:keepNext/>
+        <w:keepLines/>
+        <w:spacing w:line="240" w:lineRule="auto"/>
+        <w:ind w:firstLine="0"/>
+        <w:jc w:val="center"/>
+      </w:pPr>
+      <w:r>
+        <w:rPr>
+          <w:noProof/>
+        </w:rPr>
+        <w:drawing>
+          <wp:inline distT="0" distB="0" distL="0" distR="0" wp14:anchorId="5E9035D0" wp14:editId="5D6D47E6">
+            <wp:extent cx="2700000" cy="4800000"/>
+            <wp:effectExtent l="0" t="0" r="0" b="0"/>
+            <wp:docPr id="6" name="Picture 6"/>
+            <wp:cNvGraphicFramePr>
+              <a:graphicFrameLocks xmlns:a="http://schemas.openxmlformats.org/drawingml/2006/main" noChangeAspect="1"/>
+            </wp:cNvGraphicFramePr>
+            <a:graphic xmlns:a="http://schemas.openxmlformats.org/drawingml/2006/main">
+              <a:graphicData uri="http://schemas.openxmlformats.org/drawingml/2006/picture">
+                <pic:pic xmlns:pic="http://schemas.openxmlformats.org/drawingml/2006/picture">
+                  <pic:nvPicPr>
+                    <pic:cNvPr id="0" name="WhatsApp Image 2026-10-05 at 09.59.31.jpeg"/>
+                    <pic:cNvPicPr/>
+                  </pic:nvPicPr>
+                  <pic:blipFill>
+                    <a:blip r:embed="rId18"/>
+                    <a:stretch>
+                      <a:fillRect/>
+                    </a:stretch>
+                  </pic:blipFill>
+                  <pic:spPr>
+                    <a:xfrm>
+                      <a:off x="0" y="0"/>
+                      <a:ext cx="2700000" cy="4800000"/>
+                    </a:xfrm>
+                    <a:prstGeom prst="rect">
+                      <a:avLst/>
+                    </a:prstGeom>
+                  </pic:spPr>
+                </pic:pic>
+              </a:graphicData>
+            </a:graphic>
+          </wp:inline>
+        </w:drawing>
+      </w:r>
+      <w:r>
+        <w:t xml:space="preserve">    </w:t>
+      </w:r>
+      <w:r>
+        <w:rPr>
+          <w:noProof/>
+        </w:rPr>
+        <w:drawing>
+          <wp:inline distT="0" distB="0" distL="0" distR="0" wp14:anchorId="446C2C81" wp14:editId="04F42490">
+            <wp:extent cx="2700000" cy="4800000"/>
+            <wp:effectExtent l="0" t="0" r="0" b="0"/>
+            <wp:docPr id="7" name="Picture 7"/>
+            <wp:cNvGraphicFramePr>
+              <a:graphicFrameLocks xmlns:a="http://schemas.openxmlformats.org/drawingml/2006/main" noChangeAspect="1"/>
+            </wp:cNvGraphicFramePr>
+            <a:graphic xmlns:a="http://schemas.openxmlformats.org/drawingml/2006/main">
+              <a:graphicData uri="http://schemas.openxmlformats.org/drawingml/2006/picture">
+                <pic:pic xmlns:pic="http://schemas.openxmlformats.org/drawingml/2006/picture">
+                  <pic:nvPicPr>
+                    <pic:cNvPr id="0" name="WhatsApp Image 2026-10-05 at 09.59.30.jpeg"/>
+                    <pic:cNvPicPr/>
+                  </pic:nvPicPr>
+                  <pic:blipFill>
+                    <a:blip r:embed="rId19"/>
+                    <a:stretch>
+                      <a:fillRect/>
+                    </a:stretch>
+                  </pic:blipFill>
+                  <pic:spPr>
+                    <a:xfrm>
+                      <a:off x="0" y="0"/>
+                      <a:ext cx="2700000" cy="4800000"/>
+                    </a:xfrm>
+                    <a:prstGeom prst="rect">
+                      <a:avLst/>
+                    </a:prstGeom>
+                  </pic:spPr>
+                </pic:pic>
+              </a:graphicData>
+            </a:graphic>
+          </wp:inline>
+        </w:drawing>
+      </w:r>
+    </w:p>
+    <w:p>
+      <w:pPr>
+        <w:spacing w:before="100" w:after="160" w:line="240" w:lineRule="auto"/>
+        <w:ind w:firstLine="0"/>
+      </w:pPr>
+      <w:r>
+        <w:rPr>
+          <w:sz w:val="20"/>
+        </w:rPr>
+        <w:t>Fonte: acervo fotográfico do experimento (29 set. 2026).</w:t>
+      </w:r>
+    </w:p>
+    <w:p>
+      <w:r>
+        <w:t>À esquerda, os sensores aparecem posicionados sobre o trilho. À direita, o painel conectado aos sensores apresenta os indicadores de medição. A organização desses componentes permitia registrar o movimento do objeto para as diferentes distâncias analisadas.</w:t>
+      </w:r>
+    </w:p>
+    <w:p>
+      <w:pPr>
         <w:pStyle w:val="Heading1"/>
       </w:pPr>
       <w:r>
@@ -4955,7 +5173,7 @@
     </w:p>
     <w:p>
       <w:r>
-        <w:t>A incerteza relativa da distância diminui de 10% no primeiro ponto para cerca de 1,11% no último. As incertezas relativas dos tempos médios variam de aproximadamente 0,06% a 0,67%. A Figura 1 mostra o crescimento da distância com o tempo, sem ligar os pontos por segmentos.</w:t>
+        <w:t>A incerteza relativa da distância diminui de 10% no primeiro ponto para cerca de 1,11% no último. As incertezas relativas dos tempos médios variam de aproximadamente 0,06% a 0,67%. A Figura 3 mostra o crescimento da distância com o tempo, sem ligar os pontos por segmentos.</w:t>
       </w:r>
     </w:p>
     <w:p>
@@ -4969,7 +5187,7 @@
           <w:sz w:val="20"/>
         </w:rPr>
         <w:lastRenderedPageBreak/>
-        <w:t>Figura 1 – Dados de distância e tempo antes da linearização</w:t>
+        <w:t>Figura 3 – Dados de distância e tempo antes da linearização</w:t>
       </w:r>
     </w:p>
     <w:p>
@@ -4998,7 +5216,7 @@
                     <pic:cNvPicPr/>
                   </pic:nvPicPr>
                   <pic:blipFill>
-                    <a:blip r:embed="rId16"/>
+                    <a:blip r:embed="rId20"/>
                     <a:stretch>
                       <a:fillRect/>
                     </a:stretch>
@@ -6398,7 +6616,7 @@
     </w:p>
     <w:p>
       <w:r>
-        <w:t>O ajuste fornece A = 4,24750662, n = 1,04914260, σA = 0,00594647 e σn = 0,01878501. A Figura 2 apresenta a reta ajustada e as barras de incerteza dos nove pontos. Na apresentação final, a relação linear é:</w:t>
+        <w:t>O ajuste fornece A = 4,24750662, n = 1,04914260, σA = 0,00594647 e σn = 0,01878501. A Figura 4 apresenta a reta ajustada e as barras de incerteza dos nove pontos. Na apresentação final, a relação linear é:</w:t>
       </w:r>
     </w:p>
     <w:p>
@@ -6420,13 +6638,7 @@
           <w:rPr>
             <w:rFonts w:ascii="Cambria Math" w:hAnsi="Cambria Math"/>
           </w:rPr>
-          <m:t>Y</m:t>
-        </m:r>
-        <m:r>
-          <w:rPr>
-            <w:rFonts w:ascii="Cambria Math" w:hAnsi="Cambria Math"/>
-          </w:rPr>
-          <m:t>=</m:t>
+          <m:t>Y=</m:t>
         </m:r>
         <m:r>
           <m:rPr>
@@ -6469,7 +6681,7 @@
           <w:sz w:val="20"/>
         </w:rPr>
         <w:lastRenderedPageBreak/>
-        <w:t>Figura 2 – Linearização logarítmica e reta ajustada</w:t>
+        <w:t>Figura 4 – Linearização logarítmica e reta ajustada</w:t>
       </w:r>
     </w:p>
     <w:p>
@@ -6498,7 +6710,7 @@
                     <pic:cNvPicPr/>
                   </pic:nvPicPr>
                   <pic:blipFill>
-                    <a:blip r:embed="rId17"/>
+                    <a:blip r:embed="rId21"/>
                     <a:stretch>
                       <a:fillRect/>
                     </a:stretch>
@@ -6950,7 +7162,7 @@
         <w:rPr>
           <w:sz w:val="20"/>
         </w:rPr>
-        <w:t>Figura 3 – Lei de potência na escala original</w:t>
+        <w:t>Figura 5 – Lei de potência na escala original</w:t>
       </w:r>
     </w:p>
     <w:p>
@@ -6979,7 +7191,7 @@
                     <pic:cNvPicPr/>
                   </pic:nvPicPr>
                   <pic:blipFill>
-                    <a:blip r:embed="rId18"/>
+                    <a:blip r:embed="rId22"/>
                     <a:stretch>
                       <a:fillRect/>
                     </a:stretch>
@@ -7087,7 +7299,7 @@
         <w:jc w:val="left"/>
       </w:pPr>
       <w:r>
-        <w:t>IWAMOTO, Wellington Akira; GUARANY, Cristiano Alves; FOSCHINI, Mauricio; DI LORENZO, Antonino. Guias e roteiros para Laboratório de Física Experimental I. 1. ed. Uberlândia: Instituto de Física, Universidade Federal de Uberlândia, 2014.</w:t>
+        <w:t>ACERVO fotográfico do experimento de Física Geral Experimental I. Uberlândia, 29 set. 2026. 4 fotografias digitais.</w:t>
       </w:r>
     </w:p>
     <w:p>
@@ -7097,7 +7309,7 @@
         <w:jc w:val="left"/>
       </w:pPr>
       <w:r>
-        <w:t>ODASHIMA, Mariana M. Física Experimental 1: Laboratório de Física: Mecânica. Aula 1: apresentação do curso, teoria de erros e medidas, algarismos significativos. Uberlândia: Instituto de Física, Universidade Federal de Uberlândia, [s. d.]a. 32 slides.</w:t>
+        <w:t>IWAMOTO, Wellington Akira; GUARANY, Cristiano Alves; FOSCHINI, Mauricio; DI LORENZO, Antonino. Guias e roteiros para Laboratório de Física Experimental I. 1. ed. Uberlândia: Instituto de Física, Universidade Federal de Uberlândia, 2014.</w:t>
       </w:r>
     </w:p>
     <w:p>
@@ -7107,7 +7319,7 @@
         <w:jc w:val="left"/>
       </w:pPr>
       <w:r>
-        <w:t>ODASHIMA, Mariana M. Física Experimental 1: Lab Física: Mecânica. Aula 2: teoria de erros; erro instrumental, estatístico, total. Uberlândia: Instituto de Física, Universidade Federal de Uberlândia, [s. d.]b. 25 slides.</w:t>
+        <w:t>ODASHIMA, Mariana M. Física Experimental 1: Laboratório de Física: Mecânica. Aula 1: apresentação do curso, teoria de erros e medidas, algarismos significativos. Uberlândia: Instituto de Física, Universidade Federal de Uberlândia, [s. d.]a. 32 slides.</w:t>
       </w:r>
     </w:p>
     <w:p>
@@ -7117,7 +7329,7 @@
         <w:jc w:val="left"/>
       </w:pPr>
       <w:r>
-        <w:t>ODASHIMA, Mariana M. Física Geral Experimental: Lab Física 1: Mecânica. Aula 4: como fazer relatório. Uberlândia: Instituto de Física, Universidade Federal de Uberlândia, [s. d.]c. 25 slides.</w:t>
+        <w:t>ODASHIMA, Mariana M. Física Experimental 1: Lab Física: Mecânica. Aula 2: teoria de erros; erro instrumental, estatístico, total. Uberlândia: Instituto de Física, Universidade Federal de Uberlândia, [s. d.]b. 25 slides.</w:t>
       </w:r>
     </w:p>
     <w:p>
@@ -7127,7 +7339,7 @@
         <w:jc w:val="left"/>
       </w:pPr>
       <w:r>
-        <w:t>REGISTRO de medidas do trabalho 02 de Física Geral Experimental I. Uberlândia, 2026. Planilha medidas_fisicaEX02.xlsx, aba Medidas, e fotografia foto_medidas_2026-09-29.jpg. Registro disponibilizado em 29 set. 2026.</w:t>
+        <w:t>ODASHIMA, Mariana M. Física Geral Experimental: Lab Física 1: Mecânica. Aula 4: como fazer relatório. Uberlândia: Instituto de Física, Universidade Federal de Uberlândia, [s. d.]c. 25 slides.</w:t>
       </w:r>
     </w:p>
     <w:p>
@@ -7137,12 +7349,22 @@
         <w:jc w:val="left"/>
       </w:pPr>
       <w:r>
+        <w:t>REGISTRO de medidas do trabalho 02 de Física Geral Experimental I. Uberlândia, 2026. Planilha medidas_fisicaEX02.xlsx, aba Medidas, e fotografia foto_medidas_2026-09-29.jpg. Registro disponibilizado em 29 set. 2026.</w:t>
+      </w:r>
+    </w:p>
+    <w:p>
+      <w:pPr>
+        <w:spacing w:after="240" w:line="240" w:lineRule="auto"/>
+        <w:ind w:firstLine="0"/>
+        <w:jc w:val="left"/>
+      </w:pPr>
+      <w:r>
         <w:t>SOUSA, Lucas Soares. Aula 2 – Laboratório de Física 1. [S. l.: s. n.], [s. d.]. 19 slides. Material de aula sobre propagação de incertezas, linearização e regressão linear. Arquivo disponibilizado como Aula3-PropagacaoLinearizacao.pdf.</w:t>
       </w:r>
     </w:p>
     <w:sectPr>
-      <w:headerReference w:type="default" r:id="rId19"/>
-      <w:footerReference w:type="default" r:id="rId20"/>
+      <w:headerReference w:type="default" r:id="rId23"/>
+      <w:footerReference w:type="default" r:id="rId24"/>
       <w:pgSz w:w="11906" w:h="16838"/>
       <w:pgMar w:top="1701" w:right="1134" w:bottom="1134" w:left="1701" w:header="709" w:footer="709" w:gutter="0"/>
       <w:cols w:space="708"/>

</xml_diff>

<commit_message>
Usa Graficolab nos graficos do relatorio e referencia o programa
</commit_message>
<xml_diff>
--- a/FisicaEx02/Relatorio_Final.docx
+++ b/FisicaEx02/Relatorio_Final.docx
@@ -3787,7 +3787,7 @@
     </w:p>
     <w:p>
       <w:r>
-        <w:t>O tratamento foi realizado na sequência: cálculo das médias, avaliação da dispersão, composição das incertezas, transformação logarítmica, propagação e ajuste ponderado. Todos os pontos foram utilizados, com precisão interna preservada até a apresentação dos resultados. Os gráficos incluem barras horizontais e verticais; barras menores que os símbolos podem ficar pouco visíveis na escala adotada.</w:t>
+        <w:t>Os gráficos foram gerados no GráficoLab (2026), desenvolvido especificamente para este trabalho. Inseriram-se médias, valores linearizados e incertezas previamente calculados, sem arredondamento intermediário. vX e vY representam incertezas absolutas; a reta usa pesos 1/vY². A curva foi reconstruída com os coeficientes da reta, sem novo ajuste.</w:t>
       </w:r>
     </w:p>
     <w:p>
@@ -5246,7 +5246,7 @@
         <w:rPr>
           <w:sz w:val="20"/>
         </w:rPr>
-        <w:t>Fonte: elaboração a partir das medidas da Tabela 1. Barras de incerteza nos dois eixos.</w:t>
+        <w:t>Fonte: elaboração própria no GráficoLab (2026), com dados da Tabela 2 e barras nos dois eixos.</w:t>
       </w:r>
     </w:p>
     <w:p>
@@ -6740,7 +6740,7 @@
         <w:rPr>
           <w:sz w:val="20"/>
         </w:rPr>
-        <w:t>Fonte: elaboração a partir das medidas da Tabela 1. Barras de incerteza nos dois eixos.</w:t>
+        <w:t>Fonte: elaboração própria no GráficoLab (2026). Pesos 1/σY²; barras nos dois eixos.</w:t>
       </w:r>
     </w:p>
     <w:p>
@@ -7221,7 +7221,7 @@
         <w:rPr>
           <w:sz w:val="20"/>
         </w:rPr>
-        <w:t>Fonte: elaboração a partir das medidas da Tabela 1. Barras de incerteza nos dois eixos.</w:t>
+        <w:t>Fonte: elaboração própria no GráficoLab (2026). Curva da equação (12) e barras nos dois eixos.</w:t>
       </w:r>
     </w:p>
     <w:p>
@@ -7300,6 +7300,16 @@
       </w:pPr>
       <w:r>
         <w:t>ACERVO fotográfico do experimento de Física Geral Experimental I. Uberlândia, 29 set. 2026. 4 fotografias digitais.</w:t>
+      </w:r>
+    </w:p>
+    <w:p>
+      <w:pPr>
+        <w:spacing w:after="240" w:line="240" w:lineRule="auto"/>
+        <w:ind w:firstLine="0"/>
+        <w:jc w:val="left"/>
+      </w:pPr>
+      <w:r>
+        <w:t>GRÁFICOLAB: gráficos para Física Experimental. Versão 1.1. [S. l.: s. n.], 2026. Programa de computador desenvolvido para este trabalho. Disponível em: https://yheitor13.github.io/Fisica/. Acesso em: 5 out. 2026. Código-fonte: https://github.com/Yheitor13/Fisica/tree/main/programa-graficos.</w:t>
       </w:r>
     </w:p>
     <w:p>

</xml_diff>

<commit_message>
Organiza materiais, publica portal dos trabalhos e referencia EX01 no EX02
</commit_message>
<xml_diff>
--- a/FisicaEx02/Relatorio_Final.docx
+++ b/FisicaEx02/Relatorio_Final.docx
@@ -1013,7 +1013,7 @@
     </w:p>
     <w:p>
       <w:r>
-        <w:t>Para cada distância, a estimativa do tempo corresponde à média de N = 3 leituras. O desvio padrão amostral descreve a dispersão das leituras e a incerteza estatística da média é obtida pela divisão desse desvio por √N (Iwamoto et al., 2014; Odashima, [s. d.]b).</w:t>
+        <w:t>O tratamento anterior à linearização segue o trabalho 01 (Fernandes et al., 2026): média das três leituras, desvio padrão amostral e incerteza da média s/√N. Esse procedimento é aplicado aqui aos tempos, com N = 3.</w:t>
       </w:r>
     </w:p>
     <w:p>
@@ -1325,7 +1325,7 @@
     </w:p>
     <w:p>
       <w:r>
-        <w:t>A incerteza total do tempo combina a contribuição estatística e a instrumental pela soma dos quadrados. Essa combinação pressupõe contribuições independentes e utiliza a interpretação instrumental adotada para o conjunto de medidas (Sousa, [s. d.]).</w:t>
+        <w:t>Como no trabalho 01, a incerteza total combina as contribuições estatística e instrumental em quadratura, supondo independência. Reutiliza-se o método, com a contribuição instrumental deste experimento; não se transferem medidas ou incertezas do paquímetro (Fernandes et al., 2026; Sousa, [s. d.]).</w:t>
       </w:r>
     </w:p>
     <w:p>
@@ -4070,7 +4070,7 @@
     </w:p>
     <w:p>
       <w:r>
-        <w:t>A Tabela 2 apresenta os tempos médios e suas incertezas. O desvio padrão amostral e a incerteza estatística são mostrados com casas de guarda; os tempos acompanhados da incerteza total seguem o arredondamento final de um algarismo significativo na incerteza (Odashima, [s. d.]a).</w:t>
+        <w:t>A Tabela 2 apresenta os tempos médios e suas incertezas, calculados pelo procedimento do trabalho 01 (Fernandes et al., 2026). O desvio padrão amostral e a incerteza estatística são mostrados com casas de guarda; os tempos acompanhados da incerteza total seguem o arredondamento final de um algarismo significativo na incerteza (Odashima, [s. d.]a).</w:t>
       </w:r>
     </w:p>
     <w:p>
@@ -7309,7 +7309,17 @@
         <w:jc w:val="left"/>
       </w:pPr>
       <w:r>
-        <w:t>GRÁFICOLAB: gráficos para Física Experimental. Versão 1.1. [S. l.: s. n.], 2026. Programa de computador desenvolvido para este trabalho. Disponível em: https://yheitor13.github.io/Fisica/. Acesso em: 5 out. 2026. Código-fonte: https://github.com/Yheitor13/Fisica/tree/main/programa-graficos.</w:t>
+        <w:t>FERNANDES, Arthur Borges et al. Relatório de Física Geral Experimental I: medidas dimensionais e determinação de volumes com propagação de incertezas. Uberlândia: Universidade Federal de Uberlândia, 2026. Trabalho 01, prática de 15 set. 2026. Disponível em: https://yheitor13.github.io/Fisica/FisicaEx01/Relatório_Final.pdf. Acesso em: 5 out. 2026.</w:t>
+      </w:r>
+    </w:p>
+    <w:p>
+      <w:pPr>
+        <w:spacing w:after="240" w:line="240" w:lineRule="auto"/>
+        <w:ind w:firstLine="0"/>
+        <w:jc w:val="left"/>
+      </w:pPr>
+      <w:r>
+        <w:t>GRÁFICOLAB: gráficos para Física Experimental. Versão 1.1. [S. l.: s. n.], 2026. Programa de computador desenvolvido para este trabalho. Disponível em: https://yheitor13.github.io/Fisica/graficolab/. Acesso em: 5 out. 2026. Código-fonte: https://github.com/Yheitor13/Fisica/tree/main/apoio/programa-graficos.</w:t>
       </w:r>
     </w:p>
     <w:p>

</xml_diff>

<commit_message>
Explica baixa visibilidade das barras de incerteza na conclusão do EX02
</commit_message>
<xml_diff>
--- a/FisicaEx02/Relatorio_Final.docx
+++ b/FisicaEx02/Relatorio_Final.docx
@@ -7276,6 +7276,11 @@
     <w:p>
       <w:r>
         <w:t>A linearização logarítmica e o ajuste ponderado permitiram representar a relação entre distância e tempo por x = C(t/1 s)ⁿ, com C = (69,9 ± 0,4) cm e n = 1,05 ± 0,02. Os gráficos em escala original e logarítmica mostram que a lei de potência acompanha a tendência dos nove pontos experimentais, sob as hipóteses adotadas para as incertezas.</w:t>
+      </w:r>
+    </w:p>
+    <w:p>
+      <w:r>
+        <w:t>Na escala de apresentação dos gráficos, algumas barras de incerteza, sobretudo as horizontais, são pouco perceptíveis e podem ficar parcialmente encobertas pelos marcadores dos pontos. Essa baixa visibilidade decorre da pequena extensão das barras em relação à escala dos eixos e ao tamanho dos símbolos, não indicando ausência de incerteza nas medições. Os valores correspondentes permanecem registrados nas tabelas e considerados no tratamento dos dados, conforme as hipóteses adotadas.</w:t>
       </w:r>
     </w:p>
     <w:p>

</xml_diff>

<commit_message>
Revisa referencias da aula e descricao da ferramenta no relatorio 02
</commit_message>
<xml_diff>
--- a/FisicaEx02/Relatorio_Final.docx
+++ b/FisicaEx02/Relatorio_Final.docx
@@ -332,7 +332,14 @@
         <w:ind w:firstLine="0"/>
       </w:pPr>
       <w:r>
-        <w:t>Este trabalho analisa a relação entre distância e tempo por meio de linearização logarítmica e regressão linear ponderada. O conjunto experimental contém nove distâncias, de 10 a 90 centímetros, com três leituras de tempo para cada ponto. O tratamento calcula os tempos médios, os desvios padrão e as incertezas das médias, combina a contribuição instrumental e propaga as incertezas para os logaritmos. A lei de potência é transformada em uma relação linear, cujos coeficientes são determinados pelo método de mínimos quadrados com pesos associados às incertezas verticais. O ajuste fornece expoente n = 1,05 ± 0,02 e coeficiente C = (69,9 ± 0,4) centímetros, definido como a distância prevista para o tempo de um segundo. As figuras apresentam as medidas em escala original, a reta ajustada aos logaritmos e a curva reconstruída. O comportamento encontrado é aproximadamente linear no intervalo medido, mas não justifica impor proporcionalidade exata entre distância e tempo. A interpretação considera as hipóteses sobre as incertezas e a contribuição reduzida do erro horizontal para o ajuste.</w:t>
+        <w:t xml:space="preserve">Este trabalho analisa a relação entre distância e tempo por meio de linearização logarítmica e regressão linear ponderada. O conjunto experimental contém nove distâncias, de 10 a 90 centímetros, com três leituras de tempo para cada ponto. O tratamento calcula os tempos médios, os desvios padrão e as incertezas das médias, combina a contribuição instrumental e propaga as incertezas para os logaritmos. </w:t>
+      </w:r>
+      <w:r>
+        <w:rPr/>
+        <w:t>A lei de potência é transformada em uma relação linear, cujos coeficientes são determinados pelo método de mínimos quadrados com pesos associados às incertezas verticais</w:t>
+      </w:r>
+      <w:r>
+        <w:t>. O ajuste fornece expoente n = 1,05 ± 0,02 e coeficiente C = (69,9 ± 0,4) centímetros, definido como a distância prevista para o tempo de um segundo. As figuras apresentam as medidas em escala original, a reta ajustada aos logaritmos e a curva reconstruída. O comportamento encontrado é aproximadamente linear no intervalo medido, mas não justifica impor proporcionalidade exata entre distância e tempo. A interpretação considera as hipóteses sobre as incertezas e a contribuição reduzida do erro horizontal para o ajuste.</w:t>
       </w:r>
     </w:p>
     <w:p>
@@ -346,18 +353,29 @@
     </w:p>
     <w:p>
       <w:pPr>
+        <w:spacing w:before="360"/>
+        <w:ind w:firstLine="0"/>
+      </w:pPr>
+      <w:r>
+        <w:rPr/>
+        <w:t xml:space="preserve"/>
+      </w:r>
+      <w:r>
+        <w:rPr/>
+        <w:t/>
+      </w:r>
+      <w:r>
+        <w:t xml:space="preserve"/>
+      </w:r>
+    </w:p>
+    <w:p>
+      <w:pPr>
         <w:spacing w:line="240" w:lineRule="auto"/>
+        <w:jc w:val="center"/>
       </w:pPr>
       <w:r>
         <w:br w:type="page"/>
       </w:r>
-    </w:p>
-    <w:p>
-      <w:pPr>
-        <w:pStyle w:val="Resumo"/>
-        <w:keepNext/>
-        <w:spacing w:after="360"/>
-      </w:pPr>
       <w:r>
         <w:rPr>
           <w:b/>
@@ -1013,7 +1031,7 @@
     </w:p>
     <w:p>
       <w:r>
-        <w:t>O tratamento anterior à linearização segue o trabalho 01 (Fernandes et al., 2026): média das três leituras, desvio padrão amostral e incerteza da média s/√N. Esse procedimento é aplicado aqui aos tempos, com N = 3.</w:t>
+        <w:t>O tratamento anterior à linearização segue o slide 2 da aula (Sousa, [s. d.]) e o trabalho 01 (Fernandes et al., 2026): média, desvio padrão amostral e incerteza da média s/√N. Aplicam-se essas expressões aos tempos, com N = 3.</w:t>
       </w:r>
     </w:p>
     <w:p>
@@ -1338,6 +1356,9 @@
         <w:spacing w:before="180" w:after="180" w:line="240" w:lineRule="auto"/>
         <w:ind w:firstLine="0"/>
         <w:jc w:val="left"/>
+        <w:rPr>
+          <w:lang w:val="en-US"/>
+        </w:rPr>
       </w:pPr>
       <w:r>
         <w:tab/>
@@ -1371,6 +1392,7 @@
         <m:r>
           <w:rPr>
             <w:rFonts w:ascii="Cambria Math" w:hAnsi="Cambria Math"/>
+            <w:lang w:val="en-US"/>
           </w:rPr>
           <m:t>=</m:t>
         </m:r>
@@ -1415,6 +1437,9 @@
                       <m:rPr>
                         <m:nor/>
                       </m:rPr>
+                      <w:rPr>
+                        <w:lang w:val="en-US"/>
+                      </w:rPr>
                       <m:t>est</m:t>
                     </m:r>
                   </m:sub>
@@ -1425,6 +1450,9 @@
                   <m:rPr>
                     <m:nor/>
                   </m:rPr>
+                  <w:rPr>
+                    <w:lang w:val="en-US"/>
+                  </w:rPr>
                   <m:t>2</m:t>
                 </m:r>
               </m:sup>
@@ -1432,6 +1460,7 @@
             <m:r>
               <w:rPr>
                 <w:rFonts w:ascii="Cambria Math" w:hAnsi="Cambria Math"/>
+                <w:lang w:val="en-US"/>
               </w:rPr>
               <m:t>+</m:t>
             </m:r>
@@ -1465,6 +1494,9 @@
                       <m:rPr>
                         <m:nor/>
                       </m:rPr>
+                      <w:rPr>
+                        <w:lang w:val="en-US"/>
+                      </w:rPr>
                       <m:t>inst</m:t>
                     </m:r>
                   </m:sub>
@@ -1475,6 +1507,9 @@
                   <m:rPr>
                     <m:nor/>
                   </m:rPr>
+                  <w:rPr>
+                    <w:lang w:val="en-US"/>
+                  </w:rPr>
                   <m:t>2</m:t>
                 </m:r>
               </m:sup>
@@ -1483,6 +1518,9 @@
         </m:rad>
       </m:oMath>
       <w:r>
+        <w:rPr>
+          <w:lang w:val="en-US"/>
+        </w:rPr>
         <w:tab/>
         <w:t>(3)</w:t>
       </w:r>
@@ -1497,7 +1535,7 @@
     </w:p>
     <w:p>
       <w:r>
-        <w:t>Adota-se a lei de potência x = C(t/t₀)ⁿ, com t₀ = 1 s. Nessa forma, n é adimensional e C tem unidade de comprimento, correspondendo ao valor previsto de x para t = 1 s. Os argumentos dos logaritmos são razões adimensionais; define-se x₀ = 1 cm para conservar a unidade dos dados.</w:t>
+        <w:t>Adota-se a lei de potência x = C(t/t₀)ⁿ, equivalente à forma y = axᵇ dos slides 9 e 12 (Sousa, [s. d.]), com t₀ = 1 s. O expoente n é adimensional e C representa a distância prevista para t = 1 s. Define-se x₀ = 1 cm para escrever os logaritmos de razões adimensionais.</w:t>
       </w:r>
     </w:p>
     <w:p>
@@ -1595,7 +1633,7 @@
     </w:p>
     <w:p>
       <w:r>
-        <w:t>Aplicando a propagação de primeira ordem às funções logarítmicas, as incertezas transformadas são dadas pelas razões entre as incertezas originais e as respectivas medidas (Sousa, [s. d.]).</w:t>
+        <w:t>Aplicando a propagação de primeira ordem às funções logarítmicas, as incertezas transformadas são dadas pelas razões entre as incertezas originais e as respectivas medidas (Sousa, [s. d.], slide 13).</w:t>
       </w:r>
     </w:p>
     <w:p>
@@ -1790,7 +1828,7 @@
     </w:p>
     <w:p>
       <w:r>
-        <w:t>O método de mínimos quadrados ponderados atribui peso wᵢ = 1/σYᵢ² a cada ponto. As fórmulas do slide 16 do material de Sousa ([s. d.]) consideram as incertezas verticais e desprezam as horizontais no cálculo dos coeficientes. Nesta notação, n é o coeficiente angular e A é o intercepto.</w:t>
+        <w:t>O método de mínimos quadrados ponderados usa pesos wᵢ = 1/σYᵢ², conforme o slide 16 de Sousa ([s. d.]). O ajuste considera as incertezas verticais, desprezando as horizontais. Os coeficientes angular a e linear b desse slide são representados aqui por n e A, respectivamente.</w:t>
       </w:r>
     </w:p>
     <w:p>
@@ -2192,7 +2230,7 @@
     </w:p>
     <w:p>
       <w:r>
-        <w:t>A dispersão em torno da reta é avaliada pelo qui-quadrado. Para nove pontos e dois parâmetros ajustados, o número de graus de liberdade é ν = 7. As incertezas dos coeficientes são calculadas a partir das incertezas fornecidas e não são reescaladas pelo qui-quadrado reduzido.</w:t>
+        <w:t>Como análise complementar aos slides, avalia-se a dispersão pelo qui-quadrado, definido na equação 5.5 da apostila (Iwamoto et al., 2014). Adota-se χ² reduzido = χ²/ν, com ν = 9 − 2 = 7. As incertezas dos coeficientes seguem o slide 16, sem reescala pelo qui-quadrado reduzido.</w:t>
       </w:r>
     </w:p>
     <w:p>
@@ -2205,6 +2243,9 @@
         <w:spacing w:before="180" w:after="180" w:line="240" w:lineRule="auto"/>
         <w:ind w:firstLine="0"/>
         <w:jc w:val="left"/>
+        <w:rPr>
+          <w:lang w:val="en-US"/>
+        </w:rPr>
       </w:pPr>
       <w:r>
         <w:tab/>
@@ -2231,6 +2272,9 @@
               <m:rPr>
                 <m:nor/>
               </m:rPr>
+              <w:rPr>
+                <w:lang w:val="en-US"/>
+              </w:rPr>
               <m:t>2</m:t>
             </m:r>
           </m:sup>
@@ -2238,6 +2282,7 @@
         <m:r>
           <w:rPr>
             <w:rFonts w:ascii="Cambria Math" w:hAnsi="Cambria Math"/>
+            <w:lang w:val="en-US"/>
           </w:rPr>
           <m:t>=</m:t>
         </m:r>
@@ -2245,6 +2290,9 @@
           <m:rPr>
             <m:nor/>
           </m:rPr>
+          <w:rPr>
+            <w:lang w:val="en-US"/>
+          </w:rPr>
           <m:t>∑</m:t>
         </m:r>
         <m:f>
@@ -2269,7 +2317,51 @@
                   <m:rPr>
                     <m:nor/>
                   </m:rPr>
-                  <m:t>[Yᵢ - (A + nXᵢ)]</m:t>
+                  <w:rPr>
+                    <w:lang w:val="en-US"/>
+                  </w:rPr>
+                  <m:t>[Y</m:t>
+                </m:r>
+                <m:r>
+                  <m:rPr>
+                    <m:nor/>
+                  </m:rPr>
+                  <m:t>ᵢ</m:t>
+                </m:r>
+                <m:r>
+                  <m:rPr>
+                    <m:nor/>
+                  </m:rPr>
+                  <w:rPr>
+                    <w:lang w:val="en-US"/>
+                  </w:rPr>
+                  <m:t xml:space="preserve"> - (A + </m:t>
+                </m:r>
+                <w:proofErr w:type="spellStart"/>
+                <m:r>
+                  <m:rPr>
+                    <m:nor/>
+                  </m:rPr>
+                  <w:rPr>
+                    <w:lang w:val="en-US"/>
+                  </w:rPr>
+                  <m:t>nX</m:t>
+                </m:r>
+                <w:proofErr w:type="spellEnd"/>
+                <m:r>
+                  <m:rPr>
+                    <m:nor/>
+                  </m:rPr>
+                  <m:t>ᵢ</m:t>
+                </m:r>
+                <m:r>
+                  <m:rPr>
+                    <m:nor/>
+                  </m:rPr>
+                  <w:rPr>
+                    <w:lang w:val="en-US"/>
+                  </w:rPr>
+                  <m:t>)]</m:t>
                 </m:r>
               </m:e>
               <m:sup>
@@ -2277,6 +2369,9 @@
                   <m:rPr>
                     <m:nor/>
                   </m:rPr>
+                  <w:rPr>
+                    <w:lang w:val="en-US"/>
+                  </w:rPr>
                   <m:t>2</m:t>
                 </m:r>
               </m:sup>
@@ -2296,7 +2391,22 @@
                   <m:rPr>
                     <m:nor/>
                   </m:rPr>
-                  <m:t>σYᵢ</m:t>
+                  <m:t>σ</m:t>
+                </m:r>
+                <m:r>
+                  <m:rPr>
+                    <m:nor/>
+                  </m:rPr>
+                  <w:rPr>
+                    <w:lang w:val="en-US"/>
+                  </w:rPr>
+                  <m:t>Y</m:t>
+                </m:r>
+                <m:r>
+                  <m:rPr>
+                    <m:nor/>
+                  </m:rPr>
+                  <m:t>ᵢ</m:t>
                 </m:r>
               </m:e>
               <m:sup>
@@ -2304,6 +2414,9 @@
                   <m:rPr>
                     <m:nor/>
                   </m:rPr>
+                  <w:rPr>
+                    <w:lang w:val="en-US"/>
+                  </w:rPr>
                   <m:t>2</m:t>
                 </m:r>
               </m:sup>
@@ -2313,6 +2426,7 @@
         <m:r>
           <w:rPr>
             <w:rFonts w:ascii="Cambria Math" w:hAnsi="Cambria Math"/>
+            <w:lang w:val="en-US"/>
           </w:rPr>
           <m:t>;</m:t>
         </m:r>
@@ -2346,6 +2460,9 @@
                   <m:rPr>
                     <m:nor/>
                   </m:rPr>
+                  <w:rPr>
+                    <w:lang w:val="en-US"/>
+                  </w:rPr>
                   <m:t>red</m:t>
                 </m:r>
               </m:sub>
@@ -2356,6 +2473,9 @@
               <m:rPr>
                 <m:nor/>
               </m:rPr>
+              <w:rPr>
+                <w:lang w:val="en-US"/>
+              </w:rPr>
               <m:t>2</m:t>
             </m:r>
           </m:sup>
@@ -2363,6 +2483,7 @@
         <m:r>
           <w:rPr>
             <w:rFonts w:ascii="Cambria Math" w:hAnsi="Cambria Math"/>
+            <w:lang w:val="en-US"/>
           </w:rPr>
           <m:t>=</m:t>
         </m:r>
@@ -2396,6 +2517,9 @@
                   <m:rPr>
                     <m:nor/>
                   </m:rPr>
+                  <w:rPr>
+                    <w:lang w:val="en-US"/>
+                  </w:rPr>
                   <m:t>2</m:t>
                 </m:r>
               </m:sup>
@@ -2412,6 +2536,9 @@
         </m:f>
       </m:oMath>
       <w:r>
+        <w:rPr>
+          <w:lang w:val="en-US"/>
+        </w:rPr>
         <w:tab/>
         <w:t>(10)</w:t>
       </w:r>
@@ -3787,7 +3914,11 @@
     </w:p>
     <w:p>
       <w:r>
-        <w:t>Os gráficos foram gerados no GráficoLab (2026), desenvolvido especificamente para este trabalho. Inseriram-se médias, valores linearizados e incertezas previamente calculados, sem arredondamento intermediário. vX e vY representam incertezas absolutas; a reta usa pesos 1/vY². A curva foi reconstruída com os coeficientes da reta, sem novo ajuste.</w:t>
+        <w:rPr/>
+        <w:t>Os gráficos foram gerados com uma ferramenta de criação de gráficos (2026), software próprio desenvolvido para este relatório. Inseriram-se médias, valores linearizados e incertezas previamente calculados, sem arredondamento intermediário. vX e vY representam incertezas absolutas; a reta usa pesos 1/vY². A curva foi reconstruída com os coeficientes da reta, sem novo ajuste.</w:t>
+      </w:r>
+      <w:r>
+        <w:t/>
       </w:r>
     </w:p>
     <w:p>
@@ -5241,13 +5372,34 @@
       <w:pPr>
         <w:spacing w:before="100" w:after="160" w:line="240" w:lineRule="auto"/>
         <w:ind w:firstLine="0"/>
-      </w:pPr>
-      <w:r>
         <w:rPr>
           <w:sz w:val="20"/>
         </w:rPr>
-        <w:t>Fonte: elaboração própria no GráficoLab (2026), com dados da Tabela 2 e barras nos dois eixos.</w:t>
-      </w:r>
+      </w:pPr>
+      <w:r>
+        <w:rPr>
+          <w:sz w:val="20"/>
+        </w:rPr>
+        <w:t>Fonte: elaboração própria com a ferramenta de criação de gráficos (2026), com dados da Tabela 2 e barras nos dois eixos.</w:t>
+      </w:r>
+    </w:p>
+    <w:p>
+      <w:pPr>
+        <w:spacing w:before="100" w:after="160" w:line="240" w:lineRule="auto"/>
+        <w:ind w:firstLine="0"/>
+        <w:rPr>
+          <w:sz w:val="20"/>
+        </w:rPr>
+      </w:pPr>
+    </w:p>
+    <w:p>
+      <w:pPr>
+        <w:spacing w:before="100" w:after="160" w:line="240" w:lineRule="auto"/>
+        <w:ind w:firstLine="0"/>
+        <w:rPr>
+          <w:sz w:val="20"/>
+        </w:rPr>
+      </w:pPr>
     </w:p>
     <w:p>
       <w:pPr>
@@ -6740,7 +6892,7 @@
         <w:rPr>
           <w:sz w:val="20"/>
         </w:rPr>
-        <w:t>Fonte: elaboração própria no GráficoLab (2026). Pesos 1/σY²; barras nos dois eixos.</w:t>
+        <w:t>Fonte: elaboração própria com a ferramenta de criação de gráficos (2026). Pesos 1/σY²; barras nos dois eixos.</w:t>
       </w:r>
     </w:p>
     <w:p>
@@ -7177,7 +7329,7 @@
         </w:rPr>
         <w:drawing>
           <wp:inline distT="0" distB="0" distL="0" distR="0" wp14:anchorId="57A8828E" wp14:editId="76A57280">
-            <wp:extent cx="5760000" cy="3810233"/>
+            <wp:extent cx="5220000" cy="3453024"/>
             <wp:effectExtent l="0" t="0" r="0" b="0"/>
             <wp:docPr id="3" name="Picture 3"/>
             <wp:cNvGraphicFramePr>
@@ -7199,7 +7351,7 @@
                   <pic:spPr>
                     <a:xfrm>
                       <a:off x="0" y="0"/>
-                      <a:ext cx="5760000" cy="3810233"/>
+                      <a:ext cx="5220000" cy="3453024"/>
                     </a:xfrm>
                     <a:prstGeom prst="rect">
                       <a:avLst/>
@@ -7216,12 +7368,33 @@
       <w:pPr>
         <w:spacing w:before="100" w:after="160" w:line="240" w:lineRule="auto"/>
         <w:ind w:firstLine="0"/>
-      </w:pPr>
-      <w:r>
         <w:rPr>
           <w:sz w:val="20"/>
         </w:rPr>
-        <w:t>Fonte: elaboração própria no GráficoLab (2026). Curva da equação (12) e barras nos dois eixos.</w:t>
+      </w:pPr>
+      <w:r>
+        <w:rPr>
+          <w:sz w:val="20"/>
+        </w:rPr>
+        <w:t>Fonte: elaboração própria com a ferramenta de criação de gráficos (2026). Curva da equação (12) e barras nos dois eixos.</w:t>
+      </w:r>
+      <w:r>
+        <w:rPr>
+          <w:sz w:val="20"/>
+        </w:rPr>
+        <w:t xml:space="preserve"/>
+      </w:r>
+      <w:r>
+        <w:rPr>
+          <w:sz w:val="20"/>
+        </w:rPr>
+        <w:t/>
+      </w:r>
+      <w:r>
+        <w:rPr>
+          <w:sz w:val="20"/>
+        </w:rPr>
+        <w:t xml:space="preserve"/>
       </w:r>
     </w:p>
     <w:p>
@@ -7324,7 +7497,8 @@
         <w:jc w:val="left"/>
       </w:pPr>
       <w:r>
-        <w:t>GRÁFICOLAB: gráficos para Física Experimental. Versão 1.1. [S. l.: s. n.], 2026. Programa de computador desenvolvido para este trabalho. Disponível em: https://yheitor13.github.io/Fisica/graficolab/. Acesso em: 5 out. 2026. Código-fonte: https://github.com/Yheitor13/Fisica/tree/main/apoio/programa-graficos.</w:t>
+        <w:rPr/>
+        <w:t>FERRAMENTA de criação de gráficos. [S. l.: s. n.], 2026. Software próprio desenvolvido para este relatório. Disponível em: https://yheitor13.github.io/Fisica/calculadora-de-grafico/. Acesso em: 6 out. 2026. Código-fonte: https://github.com/Yheitor13/Fisica/tree/main/apoio/programa-graficos.</w:t>
       </w:r>
     </w:p>
     <w:p>
@@ -7384,7 +7558,16 @@
         <w:jc w:val="left"/>
       </w:pPr>
       <w:r>
-        <w:t>SOUSA, Lucas Soares. Aula 2 – Laboratório de Física 1. [S. l.: s. n.], [s. d.]. 19 slides. Material de aula sobre propagação de incertezas, linearização e regressão linear. Arquivo disponibilizado como Aula3-PropagacaoLinearizacao.pdf.</w:t>
+        <w:t xml:space="preserve">SOUSA, Lucas Soares. Aula 2 – Laboratório de Física 1. </w:t>
+      </w:r>
+      <w:r>
+        <w:rPr>
+          <w:lang w:val="en-US"/>
+        </w:rPr>
+        <w:t xml:space="preserve">[S. l.: s. n.], [s. d.]. 19 slides. </w:t>
+      </w:r>
+      <w:r>
+        <w:t>Material de aula sobre propagação de incertezas, linearização e regressão linear. Arquivo disponibilizado como Aula3-PropagacaoLinearizacao.pdf.</w:t>
       </w:r>
     </w:p>
     <w:sectPr>

</xml_diff>